<commit_message>
docs: regenerate PHASE2_FEATURES docx/pdf after UI consolidation updates
</commit_message>
<xml_diff>
--- a/PHASE2_FEATURES.docx
+++ b/PHASE2_FEATURES.docx
@@ -1183,7 +1183,7 @@
         <w:t xml:space="preserve">streamlit run app.py</w:t>
       </w:r>
       <w:r>
-        <w:t xml:space="preserve">) and select</w:t>
+        <w:t xml:space="preserve">), go to the</w:t>
       </w:r>
       <w:r>
         <w:t xml:space="preserve"> </w:t>
@@ -1193,19 +1193,67 @@
           <w:bCs/>
           <w:b/>
         </w:rPr>
-        <w:t xml:space="preserve">Configuration Solveur</w:t>
-      </w:r>
-      <w:r>
-        <w:t xml:space="preserve"> </w:t>
-      </w:r>
-      <w:r>
-        <w:t xml:space="preserve">in</w:t>
-      </w:r>
-      <w:r>
-        <w:t xml:space="preserve"> </w:t>
-      </w:r>
-      <w:r>
-        <w:t xml:space="preserve">the sidebar:</w:t>
+        <w:t xml:space="preserve">Configuration</w:t>
+      </w:r>
+      <w:r>
+        <w:t xml:space="preserve"> </w:t>
+      </w:r>
+      <w:r>
+        <w:t xml:space="preserve">page and</w:t>
+      </w:r>
+      <w:r>
+        <w:t xml:space="preserve"> </w:t>
+      </w:r>
+      <w:r>
+        <w:t xml:space="preserve">open the</w:t>
+      </w:r>
+      <w:r>
+        <w:t xml:space="preserve"> </w:t>
+      </w:r>
+      <w:r>
+        <w:rPr>
+          <w:bCs/>
+          <w:b/>
+        </w:rPr>
+        <w:t xml:space="preserve">“</w:t>
+      </w:r>
+      <w:r>
+        <w:rPr>
+          <w:bCs/>
+          <w:b/>
+        </w:rPr>
+        <w:t xml:space="preserve">Contraintes du solveur</w:t>
+      </w:r>
+      <w:r>
+        <w:rPr>
+          <w:bCs/>
+          <w:b/>
+        </w:rPr>
+        <w:t xml:space="preserve">”</w:t>
+      </w:r>
+      <w:r>
+        <w:t xml:space="preserve"> </w:t>
+      </w:r>
+      <w:r>
+        <w:t xml:space="preserve">tab (the solver settings are consolidated</w:t>
+      </w:r>
+      <w:r>
+        <w:t xml:space="preserve"> </w:t>
+      </w:r>
+      <w:r>
+        <w:t xml:space="preserve">into the single Configuration page, component</w:t>
+      </w:r>
+      <w:r>
+        <w:t xml:space="preserve"> </w:t>
+      </w:r>
+      <w:r>
+        <w:rPr>
+          <w:rStyle w:val="VerbatimChar"/>
+        </w:rPr>
+        <w:t xml:space="preserve">ui_solver_constraints.py</w:t>
+      </w:r>
+      <w:r>
+        <w:t xml:space="preserve">):</w:t>
       </w:r>
       <w:r>
         <w:t xml:space="preserve"> </w:t>
@@ -1570,7 +1618,34 @@
         <w:t xml:space="preserve"> </w:t>
       </w:r>
       <w:r>
-        <w:t xml:space="preserve">in the sidebar. Three sections:</w:t>
+        <w:t xml:space="preserve">in the sidebar</w:t>
+      </w:r>
+      <w:r>
+        <w:t xml:space="preserve"> </w:t>
+      </w:r>
+      <w:r>
+        <w:t xml:space="preserve">(</w:t>
+      </w:r>
+      <w:r>
+        <w:rPr>
+          <w:rStyle w:val="VerbatimChar"/>
+        </w:rPr>
+        <w:t xml:space="preserve">pages/4_Simulateur_Infaisabilite.py</w:t>
+      </w:r>
+      <w:r>
+        <w:t xml:space="preserve">). The page starts with an at-a-glance</w:t>
+      </w:r>
+      <w:r>
+        <w:t xml:space="preserve"> </w:t>
+      </w:r>
+      <w:r>
+        <w:t xml:space="preserve">summary of the latest run (estimated feasibility, bottleneck count, unplaced</w:t>
+      </w:r>
+      <w:r>
+        <w:t xml:space="preserve"> </w:t>
+      </w:r>
+      <w:r>
+        <w:t xml:space="preserve">students, data freshness), then offers three sections:</w:t>
       </w:r>
     </w:p>
     <w:p>
@@ -1586,25 +1661,25 @@
           <w:bCs/>
           <w:b/>
         </w:rPr>
-        <w:t xml:space="preserve">Exclure des groupes</w:t>
-      </w:r>
-      <w:r>
-        <w:t xml:space="preserve"> </w:t>
-      </w:r>
-      <w:r>
-        <w:t xml:space="preserve">— select groups to drop, run the simulation, and see</w:t>
-      </w:r>
-      <w:r>
-        <w:t xml:space="preserve"> </w:t>
-      </w:r>
-      <w:r>
-        <w:t xml:space="preserve">the feasibility change, overflow reduction, removed sessions and affected</w:t>
-      </w:r>
-      <w:r>
-        <w:t xml:space="preserve"> </w:t>
-      </w:r>
-      <w:r>
-        <w:t xml:space="preserve">students. A real CP-SAT feasibility dry-run confirms the verdict.</w:t>
+        <w:t xml:space="preserve">Suggestions automatiques</w:t>
+      </w:r>
+      <w:r>
+        <w:t xml:space="preserve"> </w:t>
+      </w:r>
+      <w:r>
+        <w:t xml:space="preserve">— analysed first (and auto-run when the latest</w:t>
+      </w:r>
+      <w:r>
+        <w:t xml:space="preserve"> </w:t>
+      </w:r>
+      <w:r>
+        <w:t xml:space="preserve">run is infeasible): proposes which groups to exclude or which resources to</w:t>
+      </w:r>
+      <w:r>
+        <w:t xml:space="preserve"> </w:t>
+      </w:r>
+      <w:r>
+        <w:t xml:space="preserve">add, ranked by impact.</w:t>
       </w:r>
     </w:p>
     <w:p>
@@ -1620,34 +1695,25 @@
           <w:bCs/>
           <w:b/>
         </w:rPr>
-        <w:t xml:space="preserve">Ajouter des ressources</w:t>
-      </w:r>
-      <w:r>
-        <w:t xml:space="preserve"> </w:t>
-      </w:r>
-      <w:r>
-        <w:t xml:space="preserve">— enter an extra</w:t>
-      </w:r>
-      <w:r>
-        <w:t xml:space="preserve"> </w:t>
-      </w:r>
-      <w:r>
-        <w:rPr>
-          <w:rStyle w:val="VerbatimChar"/>
-        </w:rPr>
-        <w:t xml:space="preserve">(room, day, block, weeks)</w:t>
-      </w:r>
-      <w:r>
-        <w:t xml:space="preserve"> </w:t>
-      </w:r>
-      <w:r>
-        <w:t xml:space="preserve">slot</w:t>
-      </w:r>
-      <w:r>
-        <w:t xml:space="preserve"> </w:t>
-      </w:r>
-      <w:r>
-        <w:t xml:space="preserve">and test whether it relieves the bottlenecks.</w:t>
+        <w:t xml:space="preserve">Exclure des groupes (manuel)</w:t>
+      </w:r>
+      <w:r>
+        <w:t xml:space="preserve"> </w:t>
+      </w:r>
+      <w:r>
+        <w:t xml:space="preserve">— select groups to drop, run the simulation,</w:t>
+      </w:r>
+      <w:r>
+        <w:t xml:space="preserve"> </w:t>
+      </w:r>
+      <w:r>
+        <w:t xml:space="preserve">and see the feasibility change, overflow reduction, removed sessions and</w:t>
+      </w:r>
+      <w:r>
+        <w:t xml:space="preserve"> </w:t>
+      </w:r>
+      <w:r>
+        <w:t xml:space="preserve">affected students. A real CP-SAT feasibility dry-run confirms the verdict.</w:t>
       </w:r>
     </w:p>
     <w:p>
@@ -1663,24 +1729,41 @@
           <w:bCs/>
           <w:b/>
         </w:rPr>
-        <w:t xml:space="preserve">Suggestions automatiques</w:t>
-      </w:r>
-      <w:r>
-        <w:t xml:space="preserve"> </w:t>
-      </w:r>
-      <w:r>
-        <w:t xml:space="preserve">— analyse detected bottlenecks and propose which</w:t>
-      </w:r>
-      <w:r>
-        <w:t xml:space="preserve"> </w:t>
-      </w:r>
-      <w:r>
-        <w:t xml:space="preserve">groups to exclude or which resources to add, with one-click apply.</w:t>
+        <w:t xml:space="preserve">Ajouter des ressources (manuel)</w:t>
+      </w:r>
+      <w:r>
+        <w:t xml:space="preserve"> </w:t>
+      </w:r>
+      <w:r>
+        <w:t xml:space="preserve">— enter an extra</w:t>
+      </w:r>
+      <w:r>
+        <w:t xml:space="preserve"> </w:t>
+      </w:r>
+      <w:r>
+        <w:rPr>
+          <w:rStyle w:val="VerbatimChar"/>
+        </w:rPr>
+        <w:t xml:space="preserve">(room, day, block,    weeks)</w:t>
+      </w:r>
+      <w:r>
+        <w:t xml:space="preserve"> </w:t>
+      </w:r>
+      <w:r>
+        <w:t xml:space="preserve">slot and test whether it relieves the bottlenecks.</w:t>
       </w:r>
     </w:p>
     <w:p>
       <w:pPr>
         <w:pStyle w:val="FirstParagraph"/>
+      </w:pPr>
+      <w:r>
+        <w:t xml:space="preserve">Suggested exclusions can be applied in one click for immediate simulation.</w:t>
+      </w:r>
+    </w:p>
+    <w:p>
+      <w:pPr>
+        <w:pStyle w:val="BodyText"/>
       </w:pPr>
       <w:r>
         <w:t xml:space="preserve">All results are clearly labelled as</w:t>

</xml_diff>